<commit_message>
Add the five confirmed 2026 winners with drafted write-ups
Drafted from the source documents pushed under "winners so far":

- Arab Award for Research in Healthcare: the exosomal pHERV-W ENV multiple
  sclerosis biomarker study (AUB), and the Arab Pangenome Reference (MBRU,
  Dubai Health)
- Arab Award in Genetics: Dr. Khalid A. Fakhro
- Hamdan Award for Distinguished Personalities: Dr. Abubaker Al Madani and
  Prof. Humaid Al-Shamsi

Each write-up cites the source documents it was built from. Arabic titles
for the two papers are translations and need the foundation's review.

Also reflows paragraphs when building, so YAML block scalars can be wrapped
for readability without producing forced line breaks in Word.

Co-Authored-By: Claude Opus 5 <noreply@anthropic.com>
Claude-Session: https://claude.ai/code/session_018MhQXadAbw2Qxg331AjnZL
</commit_message>
<xml_diff>
--- a/output/winners-press-release-2026.docx
+++ b/output/winners-press-release-2026.docx
@@ -246,7 +246,7 @@
                 <w:szCs w:val="22"/>
                 <w:rtl/>
               </w:rPr>
-              <w:t>بانتظار نتائج التحكيم</w:t>
+              <w:t>بروتين pHERV-W ENV في الحويصلات الخارجية كمؤشر حيوي ديناميكي للتنبؤ بالانتكاسات وتقييم مآل مرض التصلب المتعدد.</w:t>
             </w:r>
           </w:p>
         </w:tc>
@@ -267,7 +267,7 @@
                 <w:szCs w:val="22"/>
                 <w:rtl/>
               </w:rPr>
-              <w:t>—</w:t>
+              <w:t>فريق بحثي من الجامعة الأمريكية في بيروت – مركز نعمة وتريز تهمة للتصلب المتعدد (لبنان).</w:t>
             </w:r>
           </w:p>
         </w:tc>
@@ -286,7 +286,49 @@
                 <w:sz w:val="22"/>
                 <w:szCs w:val="22"/>
               </w:rPr>
-              <w:t>—</w:t>
+              <w:t>Multiple sclerosis (MS) is a disease in which the immune system attacks the protective covering of nerves in the brain and spinal cord. Its course is unpredictable: patients go through relapses, when symptoms flare, and long stretches of stability. Doctors have no simple blood test that tells them a relapse is coming or how aggressive a patient's disease is likely to become, and must rely largely on symptoms and repeated MRI scans.</w:t>
+            </w:r>
+          </w:p>
+          <w:p>
+            <w:pPr>
+              <w:spacing w:after="0"/>
+            </w:pPr>
+            <w:r>
+              <w:rPr>
+                <w:rFonts w:ascii="Dubai" w:hAnsi="Dubai" w:cs="Dubai"/>
+                <w:b w:val="0"/>
+                <w:sz w:val="22"/>
+                <w:szCs w:val="22"/>
+              </w:rPr>
+              <w:t>In our study, we examined a protein called pHERV-W ENV. It comes from an ancient virus whose genetic material became part of the human genome long ago, and it has long been suspected of playing a role in MS. We measured this protein on exosomes — tiny packages that cells release into the bloodstream — across three separate groups of patients: one comparing healthy people with stable and with active MS patients; one following patients before, during and after episodes of disease activity; and one tracking newly diagnosed patients over three years.</w:t>
+            </w:r>
+          </w:p>
+          <w:p>
+            <w:pPr>
+              <w:spacing w:after="0"/>
+            </w:pPr>
+            <w:r>
+              <w:rPr>
+                <w:rFonts w:ascii="Dubai" w:hAnsi="Dubai" w:cs="Dubai"/>
+                <w:b w:val="0"/>
+                <w:sz w:val="22"/>
+                <w:szCs w:val="22"/>
+              </w:rPr>
+              <w:t>We found that the protein rose while the disease was active and fell away afterwards, tracking the disease as it happened. Its levels rose alongside markers of Epstein-Barr virus activity, a virus long associated with MS, and we traced the protein mainly to two immune cell types, monocytes and B cells. Most importantly, patients whose levels were high at diagnosis went on to experience more relapses and more new lesions on MRI over the following three years, and lost their disease-free status sooner than others.</w:t>
+            </w:r>
+          </w:p>
+          <w:p>
+            <w:pPr>
+              <w:spacing w:after="0"/>
+            </w:pPr>
+            <w:r>
+              <w:rPr>
+                <w:rFonts w:ascii="Dubai" w:hAnsi="Dubai" w:cs="Dubai"/>
+                <w:b w:val="0"/>
+                <w:sz w:val="22"/>
+                <w:szCs w:val="22"/>
+              </w:rPr>
+              <w:t>Taken together, these results suggest that measuring pHERV-W ENV on exosomes could give physicians an early warning system for multiple sclerosis: a non-invasive blood test that reflects what the disease is doing now and indicates what it is likely to do next. That would allow treatment to be intensified for the patients who need it most, before irreversible damage accumulates.</w:t>
             </w:r>
           </w:p>
         </w:tc>
@@ -332,7 +374,7 @@
                 <w:szCs w:val="22"/>
                 <w:rtl/>
               </w:rPr>
-              <w:t>بانتظار نتائج التحكيم</w:t>
+              <w:t>مرجع أولي للجينوم الشامل (البانجينوم) العربي من دولة الإمارات العربية المتحدة.</w:t>
             </w:r>
           </w:p>
         </w:tc>
@@ -353,7 +395,7 @@
                 <w:szCs w:val="22"/>
                 <w:rtl/>
               </w:rPr>
-              <w:t>—</w:t>
+              <w:t>فريق بحثي من مركز الجينوم التطبيقي والانتقالي – جامعة محمد بن راشد للطب والعلوم الصحية، دبي الصحية.</w:t>
             </w:r>
           </w:p>
         </w:tc>
@@ -372,7 +414,63 @@
                 <w:sz w:val="22"/>
                 <w:szCs w:val="22"/>
               </w:rPr>
-              <w:t>—</w:t>
+              <w:t>The human genome reference that doctors and scientists use to interpret DNA was built largely from people of European ancestry. When a patient from an underrepresented population is sequenced, parts of their DNA have nothing meaningful to be compared against, and genuine differences are missed or misread. Arab populations have been among the least represented of all.</w:t>
+            </w:r>
+          </w:p>
+          <w:p>
+            <w:pPr>
+              <w:spacing w:after="0"/>
+            </w:pPr>
+            <w:r>
+              <w:rPr>
+                <w:rFonts w:ascii="Dubai" w:hAnsi="Dubai" w:cs="Dubai"/>
+                <w:b w:val="0"/>
+                <w:sz w:val="22"/>
+                <w:szCs w:val="22"/>
+              </w:rPr>
+              <w:t>In our study, we set out to close that gap by building the first Arab Pangenome Reference. Rather than a single genome, a pangenome combines many high-quality genomes into one reference that captures the range of variation within a population. We sequenced 53 individuals of diverse Arab backgrounds in the UAE using long-read technology, and carried out every stage of the work — from sequencing through bioinformatics — in-house at the Center for Applied and Translational Genomics at Mohammed Bin Rashid University of Medicine and Health Sciences, Dubai Health.</w:t>
+            </w:r>
+          </w:p>
+          <w:p>
+            <w:pPr>
+              <w:spacing w:after="0"/>
+            </w:pPr>
+            <w:r>
+              <w:rPr>
+                <w:rFonts w:ascii="Dubai" w:hAnsi="Dubai" w:cs="Dubai"/>
+                <w:b w:val="0"/>
+                <w:sz w:val="22"/>
+                <w:szCs w:val="22"/>
+              </w:rPr>
+              <w:t>The reference uncovered more than 110 million base pairs of DNA sequence absent from existing global references, along with nearly nine million small genetic differences and over 235,000 larger structural differences not previously reported. Among the discoveries was a duplicated gene, TAF11L5, found commonly in the Arab individuals we studied yet absent from global references entirely. It may play a role in regulating other genes, with implications for understanding disease risk and why individuals respond differently to treatment.</w:t>
+            </w:r>
+          </w:p>
+          <w:p>
+            <w:pPr>
+              <w:spacing w:after="0"/>
+            </w:pPr>
+            <w:r>
+              <w:rPr>
+                <w:rFonts w:ascii="Dubai" w:hAnsi="Dubai" w:cs="Dubai"/>
+                <w:b w:val="0"/>
+                <w:sz w:val="22"/>
+                <w:szCs w:val="22"/>
+              </w:rPr>
+              <w:t>To make this analysis possible we also developed PanScan, a bioinformatics tool that detects gene duplications, novel sequences and complex genomic structures within pangenomes. We released it publicly so that researchers building references for their own populations can use it.</w:t>
+            </w:r>
+          </w:p>
+          <w:p>
+            <w:pPr>
+              <w:spacing w:after="0"/>
+            </w:pPr>
+            <w:r>
+              <w:rPr>
+                <w:rFonts w:ascii="Dubai" w:hAnsi="Dubai" w:cs="Dubai"/>
+                <w:b w:val="0"/>
+                <w:sz w:val="22"/>
+                <w:szCs w:val="22"/>
+              </w:rPr>
+              <w:t>The study was published in Nature Communications and supports the UAE's National Genome Strategy. Its value is practical: a population-specific reference makes genetic diagnosis more accurate, and allows biomarkers, risk models and therapeutic targets to be developed from data that genuinely reflects the people they are meant to serve.</w:t>
             </w:r>
           </w:p>
         </w:tc>
@@ -578,7 +676,7 @@
                 <w:szCs w:val="22"/>
                 <w:rtl/>
               </w:rPr>
-              <w:t>بانتظار نتائج التحكيم</w:t>
+              <w:t>الأستاذ الدكتور خالد فخرو</w:t>
             </w:r>
           </w:p>
         </w:tc>
@@ -599,7 +697,7 @@
                 <w:szCs w:val="22"/>
                 <w:rtl/>
               </w:rPr>
-              <w:t>—</w:t>
+              <w:t>الرئيس التنفيذي للأبحاث ورئيس برنامج الطب الدقيق في مركز سدرة للطب، وأستاذ علم الجينوم والطب الدقيق بجامعة حمد بن خليفة (قطر).</w:t>
             </w:r>
           </w:p>
         </w:tc>
@@ -618,7 +716,49 @@
                 <w:sz w:val="22"/>
                 <w:szCs w:val="22"/>
               </w:rPr>
-              <w:t>—</w:t>
+              <w:t>Dr. Khalid A. Fakhro has spent his career building the field of genomics in the Arab world, and much of what exists in Qatar today was established under his hand. He graduated top of his country in 2001 and chose genetics at a time when the discipline was widely seen as offering little career prospect in the Gulf. He completed his undergraduate studies at the University of Chicago, his master's and doctorate at Yale University on full scholarships, and post-doctoral training at Weill Cornell Medicine, where he watched the Yale Genome Center take shape and recognised what next-generation sequencing would one day mean for patients in his own region.</w:t>
+            </w:r>
+          </w:p>
+          <w:p>
+            <w:pPr>
+              <w:spacing w:after="0"/>
+            </w:pPr>
+            <w:r>
+              <w:rPr>
+                <w:rFonts w:ascii="Dubai" w:hAnsi="Dubai" w:cs="Dubai"/>
+                <w:b w:val="0"/>
+                <w:sz w:val="22"/>
+                <w:szCs w:val="22"/>
+              </w:rPr>
+              <w:t>He returned to a country whose genomic research infrastructure was, in his own description, rudimentary. With a small team he spent years building the foundations — recruiting physicians, identifying families, and establishing sequencing and computational pipelines from scratch. By late 2016 more than 2,000 individuals had been sequenced, producing discoveries that drew global attention to Arab genomics. Among them were the identification of an indigenous founder Arab population descended from the earliest human migrations out of Africa, which reached the cover of Genome Research; the first high-resolution mapping of population structure across the Gulf; and the first assessment of how reference bias distorts genome interpretation for Arab patients, showing that a substantial share of so-called variant alleles are in fact the norm in Qataris, including roughly 200 wrongly catalogued as disease-causing.</w:t>
+            </w:r>
+          </w:p>
+          <w:p>
+            <w:pPr>
+              <w:spacing w:after="0"/>
+            </w:pPr>
+            <w:r>
+              <w:rPr>
+                <w:rFonts w:ascii="Dubai" w:hAnsi="Dubai" w:cs="Dubai"/>
+                <w:b w:val="0"/>
+                <w:sz w:val="22"/>
+                <w:szCs w:val="22"/>
+              </w:rPr>
+              <w:t>In 2014 he was appointed lead consultant to the Qatar Genome Program, the region's first national sequencing programme, and authored the strategy that established a national sequencing capability. As inaugural Director of Human Genetics and now Chief Research Officer at Sidra Medicine, he launched Qatar's first point-of-care whole genome sequencing service for children with rare disease, reaching a diagnostic rate of around 60 percent where conventional testing had failed, and established the region's largest autism bio-resource.</w:t>
+            </w:r>
+          </w:p>
+          <w:p>
+            <w:pPr>
+              <w:spacing w:after="0"/>
+            </w:pPr>
+            <w:r>
+              <w:rPr>
+                <w:rFonts w:ascii="Dubai" w:hAnsi="Dubai" w:cs="Dubai"/>
+                <w:b w:val="0"/>
+                <w:sz w:val="22"/>
+                <w:szCs w:val="22"/>
+              </w:rPr>
+              <w:t>Open data has been a principle throughout: his teams have contributed more than 1,000 Qatari exomes and genomes to the public domain, the largest Arab genome submission of its kind. He has built the training pathways to sustain the field, including accredited graduate programmes in genetic counselling and in genomics and precision medicine, ensuring the next generation of Arab geneticists is trained at home.</w:t>
             </w:r>
           </w:p>
         </w:tc>
@@ -1268,7 +1408,7 @@
                 <w:szCs w:val="22"/>
                 <w:rtl/>
               </w:rPr>
-              <w:t>بانتظار نتائج التحكيم</w:t>
+              <w:t>الدكتور أبوبكر عبدالرحمن شافي المدني</w:t>
             </w:r>
           </w:p>
         </w:tc>
@@ -1289,7 +1429,7 @@
                 <w:szCs w:val="22"/>
                 <w:rtl/>
               </w:rPr>
-              <w:t>—</w:t>
+              <w:t>استشاري أمراض المخ والأعصاب ورئيس قسم طب الأعصاب بمستشفى راشد، وأستاذ طب الأعصاب بجامعة محمد بن راشد للطب والعلوم الصحية.</w:t>
             </w:r>
           </w:p>
         </w:tc>
@@ -1308,7 +1448,63 @@
                 <w:sz w:val="22"/>
                 <w:szCs w:val="22"/>
               </w:rPr>
-              <w:t>—</w:t>
+              <w:t>Dr. Abubaker Abdul Rahman Shaffi Al Madani has led the Department of Neurology at Rashid Hospital since 2011, and over more than fifteen years of national service has built what is today the largest neurology service in the United Arab Emirates, caring for more than 20,000 patients each year across Rashid, Dubai and Latifa Hospitals.</w:t>
+            </w:r>
+          </w:p>
+          <w:p>
+            <w:pPr>
+              <w:spacing w:after="0"/>
+            </w:pPr>
+            <w:r>
+              <w:rPr>
+                <w:rFonts w:ascii="Dubai" w:hAnsi="Dubai" w:cs="Dubai"/>
+                <w:b w:val="0"/>
+                <w:sz w:val="22"/>
+                <w:szCs w:val="22"/>
+              </w:rPr>
+              <w:t>Under his clinical leadership the department has delivered a series of milestones of national significance. He co-developed the hospital's stroke programme to German Stroke Society accreditation, led the accreditation of Rashid Hospital as a MENACTRIMS Multiple Sclerosis Centre, and oversaw the commissioning of the 18-bed Neurology and Stroke Unit inaugurated in 2019. He has built a multidisciplinary team that maintains disease registries in multiple sclerosis, dementia, neuropathy, headache, movement disorders and epilepsy, alongside specialised clinics in neuromuscular medicine, botulinum toxin therapy, baclofen pump management and deep-brain-stimulation programming.</w:t>
+            </w:r>
+          </w:p>
+          <w:p>
+            <w:pPr>
+              <w:spacing w:after="0"/>
+            </w:pPr>
+            <w:r>
+              <w:rPr>
+                <w:rFonts w:ascii="Dubai" w:hAnsi="Dubai" w:cs="Dubai"/>
+                <w:b w:val="0"/>
+                <w:sz w:val="22"/>
+                <w:szCs w:val="22"/>
+              </w:rPr>
+              <w:t>One of his interventions illustrates his approach particularly well. He founded Dubai Health's multidisciplinary headache service and extended specialist care outward into primary health centres at Al Barsha and Nad Al Hamar. Uptake of specialist referral rose from roughly five percent to nearly fifty, with patient satisfaction between 80 and 90 percent — a measurable improvement in what ordinary patients actually receive.</w:t>
+            </w:r>
+          </w:p>
+          <w:p>
+            <w:pPr>
+              <w:spacing w:after="0"/>
+            </w:pPr>
+            <w:r>
+              <w:rPr>
+                <w:rFonts w:ascii="Dubai" w:hAnsi="Dubai" w:cs="Dubai"/>
+                <w:b w:val="0"/>
+                <w:sz w:val="22"/>
+                <w:szCs w:val="22"/>
+              </w:rPr>
+              <w:t>As an educator he is core faculty of the Rashid Hospital neurology residency programme and Professor of Neurology at Mohammed Bin Rashid University of Medicine and Health Sciences, training the Emirati neurologists who will carry the standard forward. He has authored more than 40 peer-reviewed publications, and has contributed as reviewer or co-author to the UAE's first national multiple sclerosis treatment guidelines, now integrated into the Dubai Health Authority's Ejadah Programme, to the UAE Alzheimer's disease national framework, and to Saudi consensus guidelines on myasthenia gravis.</w:t>
+            </w:r>
+          </w:p>
+          <w:p>
+            <w:pPr>
+              <w:spacing w:after="0"/>
+            </w:pPr>
+            <w:r>
+              <w:rPr>
+                <w:rFonts w:ascii="Dubai" w:hAnsi="Dubai" w:cs="Dubai"/>
+                <w:b w:val="0"/>
+                <w:sz w:val="22"/>
+                <w:szCs w:val="22"/>
+              </w:rPr>
+              <w:t>As Vice President of the Emirates Neurology Society he served as Congress President of the 3rd Dubai Neurology Congress and chaired a virtual congress convening more than 16,500 delegates worldwide. He led the first Gulf application of the European Migraine and Headache Alliance access-to-care methodology, and represents the UAE within the European Headache Federation and the World Federation of Neurology.</w:t>
             </w:r>
           </w:p>
         </w:tc>
@@ -1354,7 +1550,7 @@
                 <w:szCs w:val="22"/>
                 <w:rtl/>
               </w:rPr>
-              <w:t>بانتظار نتائج التحكيم</w:t>
+              <w:t>الأستاذ الدكتور حميد عبيد الشامسي</w:t>
             </w:r>
           </w:p>
         </w:tc>
@@ -1375,7 +1571,7 @@
                 <w:szCs w:val="22"/>
                 <w:rtl/>
               </w:rPr>
-              <w:t>—</w:t>
+              <w:t>الرئيس التنفيذي لمعهد برجيل للسرطان، ورئيس جمعية الإمارات للأورام.</w:t>
             </w:r>
           </w:p>
         </w:tc>
@@ -1394,7 +1590,63 @@
                 <w:sz w:val="22"/>
                 <w:szCs w:val="22"/>
               </w:rPr>
-              <w:t>—</w:t>
+              <w:t>Professor Humaid Obaid Al-Shamsi is Chief Executive Officer of Burjeel Cancer Institute and President of the Emirates Oncology Society. Across more than twenty years as a consultant oncologist he has worked to make cancer care in the United Arab Emirates both excellent and reachable.</w:t>
+            </w:r>
+          </w:p>
+          <w:p>
+            <w:pPr>
+              <w:spacing w:after="0"/>
+            </w:pPr>
+            <w:r>
+              <w:rPr>
+                <w:rFonts w:ascii="Dubai" w:hAnsi="Dubai" w:cs="Dubai"/>
+                <w:b w:val="0"/>
+                <w:sz w:val="22"/>
+                <w:szCs w:val="22"/>
+              </w:rPr>
+              <w:t>Since 2020 he has led the establishment of the country's largest comprehensive cancer network, with centres in Abu Dhabi, Sharjah, Al Ain and Al Ruwais, bringing specialised treatment closer to where patients live and removing the travel burden that once accompanied a diagnosis. He secured the first and only ESMO accreditation held by a cancer centre in the UAE, and established the nation's foremost comprehensive bone marrow transplant unit, which has completed 160 transplants — more than 50 of them provided free of charge to international patients of twenty nationalities. Much of that work was accomplished during the peak of the COVID-19 pandemic, when international travel was closed to patients who would otherwise have had nowhere to go. He provides free consultations to uninsured patients and works with charitable organisations so that support reaches patients irrespective of where they are treated.</w:t>
+            </w:r>
+          </w:p>
+          <w:p>
+            <w:pPr>
+              <w:spacing w:after="0"/>
+            </w:pPr>
+            <w:r>
+              <w:rPr>
+                <w:rFonts w:ascii="Dubai" w:hAnsi="Dubai" w:cs="Dubai"/>
+                <w:b w:val="0"/>
+                <w:sz w:val="22"/>
+                <w:szCs w:val="22"/>
+              </w:rPr>
+              <w:t>He has shaped national policy as much as institutional practice. Working with the Dubai Health Authority he contributed to advanced oncology care standards rolled out nationally in 2024; through the Emirates Oncology Society and the Ministry of Health and Prevention he helped develop the UAE's National Guideline for Lung Cancer Screening and Diagnosis; and he contributed to the establishment of the National Multidisciplinary Committee for Cancer Case Assessment under Ministerial Decree No. 20 of 2025.</w:t>
+            </w:r>
+          </w:p>
+          <w:p>
+            <w:pPr>
+              <w:spacing w:after="0"/>
+            </w:pPr>
+            <w:r>
+              <w:rPr>
+                <w:rFonts w:ascii="Dubai" w:hAnsi="Dubai" w:cs="Dubai"/>
+                <w:b w:val="0"/>
+                <w:sz w:val="22"/>
+                <w:szCs w:val="22"/>
+              </w:rPr>
+              <w:t>As an educator he established the first haematology and oncology fellowship programme in the country's history and chairs the fellowship committee at the National Institute for Health Specialties. He holds professorships at the University of Sharjah and RAK Medical and Health Sciences University, and international appointments as Visiting Professor at Harvard Medical School and Visiting Scientist at the Dana-Farber Cancer Institute. He has published more than 200 peer-reviewed papers and edited the most widely downloaded medical book in the MENA region, released free of charge and downloaded more than 650,000 times, followed by volumes on cancer care and on healthcare in the UAE with a further 600,000 downloads between them.</w:t>
+            </w:r>
+          </w:p>
+          <w:p>
+            <w:pPr>
+              <w:spacing w:after="0"/>
+            </w:pPr>
+            <w:r>
+              <w:rPr>
+                <w:rFonts w:ascii="Dubai" w:hAnsi="Dubai" w:cs="Dubai"/>
+                <w:b w:val="0"/>
+                <w:sz w:val="22"/>
+                <w:szCs w:val="22"/>
+              </w:rPr>
+              <w:t>He is among the most widely followed oncologists in the world, using that reach to promote early detection and to raise acceptance of cancer screening across Emirati society. In February 2025 he received the Sheikha Fatima bint Mubarak Award for Excellence and Community Intelligence in the Distinguished Personality category, presented by His Highness Sheikh Mohamed bin Zayed Al Nahyan.</w:t>
             </w:r>
           </w:p>
         </w:tc>

</xml_diff>

<commit_message>
Add source-reference audit and correct four claims it surfaced
REFERENCES.md traces every factual statement in the five write-ups to the
source document and page it came from, and marks the sentences that are
framing rather than claims about a winner.

The audit found four places where wording did not match its source:

- Fakhro: "for children with rare disease" -> the statement says families
- Fakhro: "where conventional testing had failed" -> it was a first-tier
  test, so the original wording reversed the meaning
- Fakhro: "authored the strategy" -> he was lead consultant and the
  statement credits the team
- Al-Shamsi: two books' downloads given as 600,000 -> the nomination gives
  320,000 and 315,000, so 635,000

All four are corrected in the winner files and the document is rebuilt.

Co-Authored-By: Claude Opus 5 <noreply@anthropic.com>
Claude-Session: https://claude.ai/code/session_018MhQXadAbw2Qxg331AjnZL
</commit_message>
<xml_diff>
--- a/output/winners-press-release-2026.docx
+++ b/output/winners-press-release-2026.docx
@@ -744,7 +744,7 @@
                 <w:sz w:val="22"/>
                 <w:szCs w:val="22"/>
               </w:rPr>
-              <w:t>In 2014 he was appointed lead consultant to the Qatar Genome Program, the region's first national sequencing programme, and authored the strategy that established a national sequencing capability. As inaugural Director of Human Genetics and now Chief Research Officer at Sidra Medicine, he launched Qatar's first point-of-care whole genome sequencing service for children with rare disease, reaching a diagnostic rate of around 60 percent where conventional testing had failed, and established the region's largest autism bio-resource.</w:t>
+              <w:t>In 2014 he was appointed lead consultant to the Qatar Genome Program, the region's first national sequencing programme, and led the team that set its five-year strategy and built a national sequencing capability. As inaugural Director of Human Genetics and now Chief Research Officer at Sidra Medicine, he launched Qatar's first point-of-care whole genome sequencing programme, the Qatari Mendelian Program, in which sequencing whole families as a first-line test reached a diagnostic rate of around 60 percent, and established the region's largest autism bio-resource.</w:t>
             </w:r>
           </w:p>
           <w:p>
@@ -1632,7 +1632,7 @@
                 <w:sz w:val="22"/>
                 <w:szCs w:val="22"/>
               </w:rPr>
-              <w:t>As an educator he established the first haematology and oncology fellowship programme in the country's history and chairs the fellowship committee at the National Institute for Health Specialties. He holds professorships at the University of Sharjah and RAK Medical and Health Sciences University, and international appointments as Visiting Professor at Harvard Medical School and Visiting Scientist at the Dana-Farber Cancer Institute. He has published more than 200 peer-reviewed papers and edited the most widely downloaded medical book in the MENA region, released free of charge and downloaded more than 650,000 times, followed by volumes on cancer care and on healthcare in the UAE with a further 600,000 downloads between them.</w:t>
+              <w:t>As an educator he established the first haematology and oncology fellowship programme in the country's history and chairs the fellowship committee at the National Institute for Health Specialties. He holds professorships at the University of Sharjah and RAK Medical and Health Sciences University, and international appointments as Visiting Professor at Harvard Medical School and Visiting Scientist at the Dana-Farber Cancer Institute. He has published more than 200 peer-reviewed papers and edited the most widely downloaded medical book in the MENA region, released free of charge and downloaded more than 650,000 times, followed by volumes on cancer care and on healthcare in the UAE with a further 635,000 downloads between them.</w:t>
             </w:r>
           </w:p>
           <w:p>

</xml_diff>

<commit_message>
Shorten the five write-ups and set up winner photographs
Write-ups cut from 309-429 words to 175-228. Every sentence that no source
supported was removed in the process, so each remaining statement traces to
a source document; REFERENCES.md records which ones were dropped.

No portrait exists in any uploaded document, so photos/ records what to
request for the three individual winners and which press office holds the
print-resolution original. Each personality file gains photo and
photo_credit fields to record the image once it arrives.

Co-Authored-By: Claude Opus 5 <noreply@anthropic.com>
Claude-Session: https://claude.ai/code/session_018MhQXadAbw2Qxg331AjnZL
</commit_message>
<xml_diff>
--- a/output/winners-press-release-2026.docx
+++ b/output/winners-press-release-2026.docx
@@ -286,7 +286,7 @@
                 <w:sz w:val="22"/>
                 <w:szCs w:val="22"/>
               </w:rPr>
-              <w:t>Multiple sclerosis (MS) is a disease in which the immune system attacks the protective covering of nerves in the brain and spinal cord. Its course is unpredictable: patients go through relapses, when symptoms flare, and long stretches of stability. Doctors have no simple blood test that tells them a relapse is coming or how aggressive a patient's disease is likely to become, and must rely largely on symptoms and repeated MRI scans.</w:t>
+              <w:t>The envelope protein of human endogenous retrovirus type W, pHERV-W ENV, has been implicated in the pathogenesis of multiple sclerosis, but its clinical utility as a biomarker remained incompletely defined. In our study we found it enriched on serum-derived exosomes in patients with relapsing-remitting MS, where it reflects both current disease activity and future risk.</w:t>
             </w:r>
           </w:p>
           <w:p>
@@ -300,7 +300,7 @@
                 <w:sz w:val="22"/>
                 <w:szCs w:val="22"/>
               </w:rPr>
-              <w:t>In our study, we examined a protein called pHERV-W ENV. It comes from an ancient virus whose genetic material became part of the human genome long ago, and it has long been suspected of playing a role in MS. We measured this protein on exosomes — tiny packages that cells release into the bloodstream — across three separate groups of patients: one comparing healthy people with stable and with active MS patients; one following patients before, during and after episodes of disease activity; and one tracking newly diagnosed patients over three years.</w:t>
+              <w:t>We measured exosomal pHERV-W ENV across three groups: one comparing healthy people with stable and with active disease; one following patients before, during and after episodes of activity; and one tracking newly diagnosed patients over three years.</w:t>
             </w:r>
           </w:p>
           <w:p>
@@ -314,7 +314,7 @@
                 <w:sz w:val="22"/>
                 <w:szCs w:val="22"/>
               </w:rPr>
-              <w:t>We found that the protein rose while the disease was active and fell away afterwards, tracking the disease as it happened. Its levels rose alongside markers of Epstein-Barr virus activity, a virus long associated with MS, and we traced the protein mainly to two immune cell types, monocytes and B cells. Most importantly, patients whose levels were high at diagnosis went on to experience more relapses and more new lesions on MRI over the following three years, and lost their disease-free status sooner than others.</w:t>
+              <w:t>Levels rose during active disease and declined at follow-up. They correlated with Epstein-Barr virus LMP2A expression, and monocytes and B cells were the predominant sources of the circulating protein. Patients with high levels at baseline recorded more total disease activity — clinical relapses together with new or enlarging MRI lesions — over three years, and lost "No Evidence of Disease Activity" status sooner.</w:t>
             </w:r>
           </w:p>
           <w:p>
@@ -328,7 +328,7 @@
                 <w:sz w:val="22"/>
                 <w:szCs w:val="22"/>
               </w:rPr>
-              <w:t>Taken together, these results suggest that measuring pHERV-W ENV on exosomes could give physicians an early warning system for multiple sclerosis: a non-invasive blood test that reflects what the disease is doing now and indicates what it is likely to do next. That would allow treatment to be intensified for the patients who need it most, before irreversible damage accumulates.</w:t>
+              <w:t>Exosomal pHERV-W ENV may therefore serve as a dynamic, non-invasive biomarker of disease activity with prognostic value in multiple sclerosis.</w:t>
             </w:r>
           </w:p>
         </w:tc>
@@ -414,7 +414,7 @@
                 <w:sz w:val="22"/>
                 <w:szCs w:val="22"/>
               </w:rPr>
-              <w:t>The human genome reference that doctors and scientists use to interpret DNA was built largely from people of European ancestry. When a patient from an underrepresented population is sequenced, parts of their DNA have nothing meaningful to be compared against, and genuine differences are missed or misread. Arab populations have been among the least represented of all.</w:t>
+              <w:t>Global DNA references have historically underrepresented Arab populations. In our study we built the first Arab Pangenome Reference, from high-quality long-read sequencing of 53 people of diverse Arab backgrounds in the UAE. Every stage, from sequencing to advanced bioinformatics, was completed in-house at the Center for Applied and Translational Genomics at Mohammed Bin Rashid University of Medicine and Health Sciences, Dubai Health.</w:t>
             </w:r>
           </w:p>
           <w:p>
@@ -428,7 +428,7 @@
                 <w:sz w:val="22"/>
                 <w:szCs w:val="22"/>
               </w:rPr>
-              <w:t>In our study, we set out to close that gap by building the first Arab Pangenome Reference. Rather than a single genome, a pangenome combines many high-quality genomes into one reference that captures the range of variation within a population. We sequenced 53 individuals of diverse Arab backgrounds in the UAE using long-read technology, and carried out every stage of the work — from sequencing through bioinformatics — in-house at the Center for Applied and Translational Genomics at Mohammed Bin Rashid University of Medicine and Health Sciences, Dubai Health.</w:t>
+              <w:t>The reference uncovered over 110 million base pairs of novel DNA sequence, nearly nine million small differences and more than 235,000 larger structural differences specific to Arab populations, none of them previously reported. One notable discovery was the duplicated gene TAF11L5, highly enriched in the individuals studied but absent from global references; it may play a role in regulating other genes, with implications for disease risk and individual variation in treatment response.</w:t>
             </w:r>
           </w:p>
           <w:p>
@@ -442,35 +442,7 @@
                 <w:sz w:val="22"/>
                 <w:szCs w:val="22"/>
               </w:rPr>
-              <w:t>The reference uncovered more than 110 million base pairs of DNA sequence absent from existing global references, along with nearly nine million small genetic differences and over 235,000 larger structural differences not previously reported. Among the discoveries was a duplicated gene, TAF11L5, found commonly in the Arab individuals we studied yet absent from global references entirely. It may play a role in regulating other genes, with implications for understanding disease risk and why individuals respond differently to treatment.</w:t>
-            </w:r>
-          </w:p>
-          <w:p>
-            <w:pPr>
-              <w:spacing w:after="0"/>
-            </w:pPr>
-            <w:r>
-              <w:rPr>
-                <w:rFonts w:ascii="Dubai" w:hAnsi="Dubai" w:cs="Dubai"/>
-                <w:b w:val="0"/>
-                <w:sz w:val="22"/>
-                <w:szCs w:val="22"/>
-              </w:rPr>
-              <w:t>To make this analysis possible we also developed PanScan, a bioinformatics tool that detects gene duplications, novel sequences and complex genomic structures within pangenomes. We released it publicly so that researchers building references for their own populations can use it.</w:t>
-            </w:r>
-          </w:p>
-          <w:p>
-            <w:pPr>
-              <w:spacing w:after="0"/>
-            </w:pPr>
-            <w:r>
-              <w:rPr>
-                <w:rFonts w:ascii="Dubai" w:hAnsi="Dubai" w:cs="Dubai"/>
-                <w:b w:val="0"/>
-                <w:sz w:val="22"/>
-                <w:szCs w:val="22"/>
-              </w:rPr>
-              <w:t>The study was published in Nature Communications and supports the UAE's National Genome Strategy. Its value is practical: a population-specific reference makes genetic diagnosis more accurate, and allows biomarkers, risk models and therapeutic targets to be developed from data that genuinely reflects the people they are meant to serve.</w:t>
+              <w:t>The project also produced PanScan, a tool that detects gene duplications, novel DNA changes and complex DNA structures, now publicly available on GitHub. Published in Nature Communications, the reference enables population-specific biomarkers, risk models and therapeutic targets, and supports the UAE's National Genome Strategy.</w:t>
             </w:r>
           </w:p>
         </w:tc>
@@ -716,7 +688,7 @@
                 <w:sz w:val="22"/>
                 <w:szCs w:val="22"/>
               </w:rPr>
-              <w:t>Dr. Khalid A. Fakhro has spent his career building the field of genomics in the Arab world, and much of what exists in Qatar today was established under his hand. He graduated top of his country in 2001 and chose genetics at a time when the discipline was widely seen as offering little career prospect in the Gulf. He completed his undergraduate studies at the University of Chicago, his master's and doctorate at Yale University on full scholarships, and post-doctoral training at Weill Cornell Medicine, where he watched the Yale Genome Center take shape and recognised what next-generation sequencing would one day mean for patients in his own region.</w:t>
+              <w:t>Dr. Khalid A. Fakhro graduated top of his country in 2001 and chose genetics, a discipline then perceived as offering limited career prospects in the GCC. He took his BA at the University of Chicago and his master's and PhD at Yale University on full scholarships, then trained at Weill Cornell Medicine.</w:t>
             </w:r>
           </w:p>
           <w:p>
@@ -730,7 +702,7 @@
                 <w:sz w:val="22"/>
                 <w:szCs w:val="22"/>
               </w:rPr>
-              <w:t>He returned to a country whose genomic research infrastructure was, in his own description, rudimentary. With a small team he spent years building the foundations — recruiting physicians, identifying families, and establishing sequencing and computational pipelines from scratch. By late 2016 more than 2,000 individuals had been sequenced, producing discoveries that drew global attention to Arab genomics. Among them were the identification of an indigenous founder Arab population descended from the earliest human migrations out of Africa, which reached the cover of Genome Research; the first high-resolution mapping of population structure across the Gulf; and the first assessment of how reference bias distorts genome interpretation for Arab patients, showing that a substantial share of so-called variant alleles are in fact the norm in Qataris, including roughly 200 wrongly catalogued as disease-causing.</w:t>
+              <w:t>He returned to Qatar, where local genomic research infrastructure was, in his own words, rudimentary. With a small team he had sequenced more than 2,000 individuals by late 2016. Their discoveries included an indigenous founder Arab population descended from the earliest human migrations out of Africa, featured on the February 2016 cover of Genome Research, and the first study of reference bias in Arab patients, which found nearly 15 percent of "variant alleles" should be considered reference in Qataris, around 200 of them mis-labelled as pathogenic in OMIM.</w:t>
             </w:r>
           </w:p>
           <w:p>
@@ -744,21 +716,7 @@
                 <w:sz w:val="22"/>
                 <w:szCs w:val="22"/>
               </w:rPr>
-              <w:t>In 2014 he was appointed lead consultant to the Qatar Genome Program, the region's first national sequencing programme, and led the team that set its five-year strategy and built a national sequencing capability. As inaugural Director of Human Genetics and now Chief Research Officer at Sidra Medicine, he launched Qatar's first point-of-care whole genome sequencing programme, the Qatari Mendelian Program, in which sequencing whole families as a first-line test reached a diagnostic rate of around 60 percent, and established the region's largest autism bio-resource.</w:t>
-            </w:r>
-          </w:p>
-          <w:p>
-            <w:pPr>
-              <w:spacing w:after="0"/>
-            </w:pPr>
-            <w:r>
-              <w:rPr>
-                <w:rFonts w:ascii="Dubai" w:hAnsi="Dubai" w:cs="Dubai"/>
-                <w:b w:val="0"/>
-                <w:sz w:val="22"/>
-                <w:szCs w:val="22"/>
-              </w:rPr>
-              <w:t>Open data has been a principle throughout: his teams have contributed more than 1,000 Qatari exomes and genomes to the public domain, the largest Arab genome submission of its kind. He has built the training pathways to sustain the field, including accredited graduate programmes in genetic counselling and in genomics and precision medicine, ensuring the next generation of Arab geneticists is trained at home.</w:t>
+              <w:t>Appointed lead consultant to the Qatar Genome Program in 2014 and inaugural Director of Human Genetics at Sidra Medicine in 2016, he established Qatar's first point-of-care whole genome sequencing programme, which reached a diagnostic rate of around 60 percent, and the region's largest bio-resource for autism. His teams have contributed more than 1,000 Qatari exomes and genomes to the public domain — the largest Arab genome submission to a public database to date.</w:t>
             </w:r>
           </w:p>
         </w:tc>
@@ -1448,7 +1406,7 @@
                 <w:sz w:val="22"/>
                 <w:szCs w:val="22"/>
               </w:rPr>
-              <w:t>Dr. Abubaker Abdul Rahman Shaffi Al Madani has led the Department of Neurology at Rashid Hospital since 2011, and over more than fifteen years of national service has built what is today the largest neurology service in the United Arab Emirates, caring for more than 20,000 patients each year across Rashid, Dubai and Latifa Hospitals.</w:t>
+              <w:t>Dr. Abubaker Abdul Rahman Shaffi Al Madani is Consultant Neurologist and Head of the Department of Neurology at Rashid Hospital, and Professor of Neurology at Mohammed Bin Rashid University of Medicine and Health Sciences. Leading that department since 2011, he has built the largest neurology service in the United Arab Emirates, caring for more than 20,000 patients each year across Rashid, Dubai and Latifa Hospitals.</w:t>
             </w:r>
           </w:p>
           <w:p>
@@ -1462,7 +1420,7 @@
                 <w:sz w:val="22"/>
                 <w:szCs w:val="22"/>
               </w:rPr>
-              <w:t>Under his clinical leadership the department has delivered a series of milestones of national significance. He co-developed the hospital's stroke programme to German Stroke Society accreditation, led the accreditation of Rashid Hospital as a MENACTRIMS Multiple Sclerosis Centre, and oversaw the commissioning of the 18-bed Neurology and Stroke Unit inaugurated in 2019. He has built a multidisciplinary team that maintains disease registries in multiple sclerosis, dementia, neuropathy, headache, movement disorders and epilepsy, alongside specialised clinics in neuromuscular medicine, botulinum toxin therapy, baclofen pump management and deep-brain-stimulation programming.</w:t>
+              <w:t>Under his leadership the department took its stroke programme to German Stroke Society accreditation, gained accreditation as a MENACTRIMS multiple sclerosis centre, and commissioned the 18-bed Neurology and Stroke Unit inaugurated in 2019. It maintains registries in multiple sclerosis, dementia, neuropathy, headache, movement disorders and epilepsy, alongside specialised clinics in neuromuscular medicine, botulinum toxin therapy and deep-brain-stimulation programming.</w:t>
             </w:r>
           </w:p>
           <w:p>
@@ -1476,7 +1434,7 @@
                 <w:sz w:val="22"/>
                 <w:szCs w:val="22"/>
               </w:rPr>
-              <w:t>One of his interventions illustrates his approach particularly well. He founded Dubai Health's multidisciplinary headache service and extended specialist care outward into primary health centres at Al Barsha and Nad Al Hamar. Uptake of specialist referral rose from roughly five percent to nearly fifty, with patient satisfaction between 80 and 90 percent — a measurable improvement in what ordinary patients actually receive.</w:t>
+              <w:t>He founded Dubai Health's multidisciplinary headache service, extending specialist care to Al Barsha and Nad Al Hamar primary health centres; specialist-referral uptake rose from approximately five percent to nearly fifty, with patient satisfaction of 80 to 90 percent.</w:t>
             </w:r>
           </w:p>
           <w:p>
@@ -1490,21 +1448,7 @@
                 <w:sz w:val="22"/>
                 <w:szCs w:val="22"/>
               </w:rPr>
-              <w:t>As an educator he is core faculty of the Rashid Hospital neurology residency programme and Professor of Neurology at Mohammed Bin Rashid University of Medicine and Health Sciences, training the Emirati neurologists who will carry the standard forward. He has authored more than 40 peer-reviewed publications, and has contributed as reviewer or co-author to the UAE's first national multiple sclerosis treatment guidelines, now integrated into the Dubai Health Authority's Ejadah Programme, to the UAE Alzheimer's disease national framework, and to Saudi consensus guidelines on myasthenia gravis.</w:t>
-            </w:r>
-          </w:p>
-          <w:p>
-            <w:pPr>
-              <w:spacing w:after="0"/>
-            </w:pPr>
-            <w:r>
-              <w:rPr>
-                <w:rFonts w:ascii="Dubai" w:hAnsi="Dubai" w:cs="Dubai"/>
-                <w:b w:val="0"/>
-                <w:sz w:val="22"/>
-                <w:szCs w:val="22"/>
-              </w:rPr>
-              <w:t>As Vice President of the Emirates Neurology Society he served as Congress President of the 3rd Dubai Neurology Congress and chaired a virtual congress convening more than 16,500 delegates worldwide. He led the first Gulf application of the European Migraine and Headache Alliance access-to-care methodology, and represents the UAE within the European Headache Federation and the World Federation of Neurology.</w:t>
+              <w:t>Core faculty of the hospital's neurology residency programme and Vice President of the Emirates Neurology Society, he has authored more than 40 peer-reviewed publications and contributed to the UAE's first national multiple sclerosis treatment guidelines, now in the DHA's Ejadah Programme, and to the UAE Alzheimer's disease national framework.</w:t>
             </w:r>
           </w:p>
         </w:tc>
@@ -1590,7 +1534,7 @@
                 <w:sz w:val="22"/>
                 <w:szCs w:val="22"/>
               </w:rPr>
-              <w:t>Professor Humaid Obaid Al-Shamsi is Chief Executive Officer of Burjeel Cancer Institute and President of the Emirates Oncology Society. Across more than twenty years as a consultant oncologist he has worked to make cancer care in the United Arab Emirates both excellent and reachable.</w:t>
+              <w:t>Professor Humaid Obaid Al-Shamsi is CEO of Burjeel Cancer Institute and President of the Emirates Oncology Society, with more than 20 years of experience as a consultant oncologist. Since joining Burjeel Holdings in September 2020 he has led the establishment of the UAE's largest comprehensive cancer network, with centres in Abu Dhabi, Sharjah, Al Ain and Al Ruwais, bringing specialised services closer to patients' homes. He provides free consultations to uninsured cancer patients and works with charitable organisations so that support reaches patients wherever they are treated.</w:t>
             </w:r>
           </w:p>
           <w:p>
@@ -1604,7 +1548,7 @@
                 <w:sz w:val="22"/>
                 <w:szCs w:val="22"/>
               </w:rPr>
-              <w:t>Since 2020 he has led the establishment of the country's largest comprehensive cancer network, with centres in Abu Dhabi, Sharjah, Al Ain and Al Ruwais, bringing specialised treatment closer to where patients live and removing the travel burden that once accompanied a diagnosis. He secured the first and only ESMO accreditation held by a cancer centre in the UAE, and established the nation's foremost comprehensive bone marrow transplant unit, which has completed 160 transplants — more than 50 of them provided free of charge to international patients of twenty nationalities. Much of that work was accomplished during the peak of the COVID-19 pandemic, when international travel was closed to patients who would otherwise have had nowhere to go. He provides free consultations to uninsured patients and works with charitable organisations so that support reaches patients irrespective of where they are treated.</w:t>
+              <w:t>He secured the first and only ESMO accreditation for a UAE cancer centre, and established the nation's foremost comprehensive bone marrow transplant unit, which has completed 160 transplants, more than 50 of them free of charge to international patients from 20 nationalities — accomplished during the peak of the COVID-19 pandemic, when international travel was restricted.</w:t>
             </w:r>
           </w:p>
           <w:p>
@@ -1618,35 +1562,7 @@
                 <w:sz w:val="22"/>
                 <w:szCs w:val="22"/>
               </w:rPr>
-              <w:t>He has shaped national policy as much as institutional practice. Working with the Dubai Health Authority he contributed to advanced oncology care standards rolled out nationally in 2024; through the Emirates Oncology Society and the Ministry of Health and Prevention he helped develop the UAE's National Guideline for Lung Cancer Screening and Diagnosis; and he contributed to the establishment of the National Multidisciplinary Committee for Cancer Case Assessment under Ministerial Decree No. 20 of 2025.</w:t>
-            </w:r>
-          </w:p>
-          <w:p>
-            <w:pPr>
-              <w:spacing w:after="0"/>
-            </w:pPr>
-            <w:r>
-              <w:rPr>
-                <w:rFonts w:ascii="Dubai" w:hAnsi="Dubai" w:cs="Dubai"/>
-                <w:b w:val="0"/>
-                <w:sz w:val="22"/>
-                <w:szCs w:val="22"/>
-              </w:rPr>
-              <w:t>As an educator he established the first haematology and oncology fellowship programme in the country's history and chairs the fellowship committee at the National Institute for Health Specialties. He holds professorships at the University of Sharjah and RAK Medical and Health Sciences University, and international appointments as Visiting Professor at Harvard Medical School and Visiting Scientist at the Dana-Farber Cancer Institute. He has published more than 200 peer-reviewed papers and edited the most widely downloaded medical book in the MENA region, released free of charge and downloaded more than 650,000 times, followed by volumes on cancer care and on healthcare in the UAE with a further 635,000 downloads between them.</w:t>
-            </w:r>
-          </w:p>
-          <w:p>
-            <w:pPr>
-              <w:spacing w:after="0"/>
-            </w:pPr>
-            <w:r>
-              <w:rPr>
-                <w:rFonts w:ascii="Dubai" w:hAnsi="Dubai" w:cs="Dubai"/>
-                <w:b w:val="0"/>
-                <w:sz w:val="22"/>
-                <w:szCs w:val="22"/>
-              </w:rPr>
-              <w:t>He is among the most widely followed oncologists in the world, using that reach to promote early detection and to raise acceptance of cancer screening across Emirati society. In February 2025 he received the Sheikha Fatima bint Mubarak Award for Excellence and Community Intelligence in the Distinguished Personality category, presented by His Highness Sheikh Mohamed bin Zayed Al Nahyan.</w:t>
+              <w:t>He contributed to the national rollout of advanced oncology care standards in 2024, to the UAE's National Guideline for Lung Cancer Screening and Diagnosis, and to the National Multidisciplinary Committee for Cancer Case Assessment established under Ministerial Decree No. 20 of 2025. He founded the first hematology and oncology fellowship programme in the UAE's history and is Visiting Professor at Harvard Medical School. In February 2025 he received the Sheikha Fatima bint Mubarak Program for Excellence and Community Intelligence Award in the Distinguished Personality category.</w:t>
             </w:r>
           </w:p>
         </w:tc>

</xml_diff>